<commit_message>
Point the Appendix A Dubach citation at the same historic-options-dataset URL as Table 1.
Co-authored-by: Cursor <cursoragent@cursor.com>
</commit_message>
<xml_diff>
--- a/milestone1/dx699-milestone-one-draft-v9_final.docx
+++ b/milestone1/dx699-milestone-one-draft-v9_final.docx
@@ -1254,20 +1254,7 @@
         <w:t>Historic options dataset: SPY, IWM, and QQQ options 2008–2025</w:t>
       </w:r>
       <w:r>
-        <w:t xml:space="preserve"> [Data set]. GitHub. SPY options chain, December 31, 2024. Original GitHub repository no longer available. File: </w:t>
-      </w:r>
-      <w:proofErr w:type="spellStart"/>
-      <w:r>
-        <w:t>SPY_</w:t>
-      </w:r>
-      <w:proofErr w:type="gramStart"/>
-      <w:r>
-        <w:t>options.parquet</w:t>
-      </w:r>
-      <w:proofErr w:type="spellEnd"/>
-      <w:proofErr w:type="gramEnd"/>
-      <w:r>
-        <w:t>, from: https://github.com/lambdaclass/options_portfolio_backtester/releases/</w:t>
+        <w:t xml:space="preserve"> [Data set]. GitHub. SPY options chain, December 31, 2024. https://github.com/philippdubach/historic-options-dataset</w:t>
       </w:r>
     </w:p>
     <w:p>

</xml_diff>